<commit_message>
Add IP1 signature line to 2ip template; fix photo slot mappings for all 6 combos
</commit_message>
<xml_diff>
--- a/poa_template_2ip_1agent.docx
+++ b/poa_template_2ip_1agent.docx
@@ -737,7 +737,6 @@
           <w:tab w:val="left" w:pos="3886"/>
           <w:tab w:val="left" w:pos="7470"/>
         </w:tabs>
-        <w:spacing w:line="480" w:lineRule="auto"/>
         <w:ind w:firstLine="0"/>
         <w:jc w:val="both"/>
       </w:pPr>
@@ -757,7 +756,6 @@
           <w:tab w:val="left" w:pos="3886"/>
           <w:tab w:val="left" w:pos="7470"/>
         </w:tabs>
-        <w:spacing w:line="480" w:lineRule="auto"/>
         <w:ind w:firstLine="0"/>
         <w:jc w:val="both"/>
         <w:rPr>
@@ -765,6 +763,48 @@
           <w:u w:val="single"/>
         </w:rPr>
       </w:pPr>
+      <w:r>
+        <w:rPr>
+          <w:szCs w:val="24"/>
+          <w:u w:val="single"/>
+        </w:rPr>
+        <w:tab/>
+      </w:r>
+      <w:r>
+        <w:rPr>
+          <w:szCs w:val="24"/>
+          <w:u w:val="single"/>
+        </w:rPr>
+        <w:tab/>
+      </w:r>
+      <w:r>
+        <w:rPr>
+          <w:szCs w:val="24"/>
+          <w:u w:val="single"/>
+        </w:rPr>
+        <w:tab/>
+      </w:r>
+      <w:r>
+        <w:rPr>
+          <w:szCs w:val="24"/>
+          <w:u w:val="single"/>
+        </w:rPr>
+        <w:tab/>
+      </w:r>
+      <w:r>
+        <w:rPr>
+          <w:szCs w:val="24"/>
+          <w:u w:val="single"/>
+        </w:rPr>
+        <w:tab/>
+      </w:r>
+      <w:r>
+        <w:rPr>
+          <w:szCs w:val="24"/>
+          <w:u w:val="single"/>
+        </w:rPr>
+        <w:tab/>
+      </w:r>
     </w:p>
     <w:p>
       <w:pPr>

</xml_diff>

<commit_message>
Fix IP1 signature line width: copy para 25 structure instead of full-page underline
</commit_message>
<xml_diff>
--- a/poa_template_2ip_1agent.docx
+++ b/poa_template_2ip_1agent.docx
@@ -750,58 +750,51 @@
     <w:p>
       <w:pPr>
         <w:pStyle w:val="BodyText"/>
-        <w:tabs>
-          <w:tab w:val="left" w:pos="640"/>
-          <w:tab w:val="left" w:pos="1775"/>
-          <w:tab w:val="left" w:pos="3886"/>
-          <w:tab w:val="left" w:pos="7470"/>
-        </w:tabs>
         <w:ind w:firstLine="0"/>
-        <w:jc w:val="both"/>
-        <w:rPr>
+        <w:rPr>
+          <w:rFonts w:eastAsia="Times New Roman"/>
           <w:szCs w:val="24"/>
-          <w:u w:val="single"/>
-        </w:rPr>
-      </w:pPr>
-      <w:r>
-        <w:rPr>
+        </w:rPr>
+      </w:pPr>
+      <w:r>
+        <w:rPr>
+          <w:rFonts w:eastAsia="Times New Roman"/>
           <w:szCs w:val="24"/>
-          <w:u w:val="single"/>
         </w:rPr>
         <w:tab/>
       </w:r>
       <w:r>
         <w:rPr>
+          <w:rFonts w:eastAsia="Times New Roman"/>
           <w:szCs w:val="24"/>
-          <w:u w:val="single"/>
         </w:rPr>
         <w:tab/>
       </w:r>
       <w:r>
         <w:rPr>
+          <w:rFonts w:eastAsia="Times New Roman"/>
           <w:szCs w:val="24"/>
-          <w:u w:val="single"/>
         </w:rPr>
         <w:tab/>
       </w:r>
       <w:r>
         <w:rPr>
+          <w:rFonts w:eastAsia="Times New Roman"/>
           <w:szCs w:val="24"/>
-          <w:u w:val="single"/>
         </w:rPr>
         <w:tab/>
       </w:r>
       <w:r>
         <w:rPr>
+          <w:rFonts w:eastAsia="Times New Roman"/>
           <w:szCs w:val="24"/>
-          <w:u w:val="single"/>
         </w:rPr>
         <w:tab/>
       </w:r>
       <w:r>
         <w:rPr>
+          <w:rFonts w:eastAsia="Times New Roman"/>
           <w:szCs w:val="24"/>
-          <w:u w:val="single"/>
         </w:rPr>
         <w:tab/>
       </w:r>

</xml_diff>